<commit_message>
hoan thien xong phan 1 va 1 chut phan 2
</commit_message>
<xml_diff>
--- a/docs/KẾ HOẠCH THỰC BTL.docx
+++ b/docs/KẾ HOẠCH THỰC BTL.docx
@@ -775,6 +775,143 @@
     </w:p>
     <w:p>
       <w:pPr>
+        <w:pStyle w:val="oancuaDanhsach"/>
+        <w:numPr>
+          <w:ilvl w:val="0"/>
+          <w:numId w:val="16"/>
+        </w:numPr>
+        <w:spacing w:before="120" w:after="120" w:line="288" w:lineRule="auto"/>
+        <w:jc w:val="both"/>
+        <w:rPr>
+          <w:rFonts w:ascii="Times New Roman" w:eastAsia="Times New Roman" w:hAnsi="Times New Roman" w:cs="Times New Roman"/>
+          <w:bCs/>
+          <w:i/>
+          <w:iCs/>
+          <w:sz w:val="26"/>
+          <w:szCs w:val="26"/>
+          <w:u w:val="single"/>
+        </w:rPr>
+      </w:pPr>
+      <w:r>
+        <w:rPr>
+          <w:rFonts w:ascii="Times New Roman" w:eastAsia="Times New Roman" w:hAnsi="Times New Roman" w:cs="Times New Roman"/>
+          <w:bCs/>
+          <w:i/>
+          <w:iCs/>
+          <w:sz w:val="26"/>
+          <w:szCs w:val="26"/>
+          <w:u w:val="single"/>
+        </w:rPr>
+        <w:t>Đối tượng khách hàng mục tiêu</w:t>
+      </w:r>
+    </w:p>
+    <w:p>
+      <w:pPr>
+        <w:ind w:firstLine="360"/>
+        <w:rPr>
+          <w:rFonts w:ascii="Times New Roman" w:hAnsi="Times New Roman" w:cs="Times New Roman"/>
+          <w:sz w:val="26"/>
+          <w:szCs w:val="26"/>
+        </w:rPr>
+      </w:pPr>
+      <w:r>
+        <w:rPr>
+          <w:rFonts w:ascii="Times New Roman" w:hAnsi="Times New Roman" w:cs="Times New Roman"/>
+          <w:sz w:val="26"/>
+          <w:szCs w:val="26"/>
+        </w:rPr>
+        <w:t>Người dùng phổ thông</w:t>
+      </w:r>
+      <w:r>
+        <w:rPr>
+          <w:rFonts w:ascii="Times New Roman" w:hAnsi="Times New Roman" w:cs="Times New Roman"/>
+          <w:sz w:val="26"/>
+          <w:szCs w:val="26"/>
+        </w:rPr>
+        <w:t>: Được phép nghe nhạc miễn phí và đăng tải nhạc, việc đăng tải nhạc chỉ cho phép đăng tải 12h thời lượng nhạc</w:t>
+      </w:r>
+    </w:p>
+    <w:p>
+      <w:pPr>
+        <w:ind w:firstLine="360"/>
+        <w:rPr>
+          <w:rFonts w:ascii="Times New Roman" w:hAnsi="Times New Roman" w:cs="Times New Roman"/>
+          <w:sz w:val="26"/>
+          <w:szCs w:val="26"/>
+        </w:rPr>
+      </w:pPr>
+      <w:r>
+        <w:rPr>
+          <w:rFonts w:ascii="Times New Roman" w:hAnsi="Times New Roman" w:cs="Times New Roman"/>
+          <w:sz w:val="26"/>
+          <w:szCs w:val="26"/>
+        </w:rPr>
+        <w:t>Nhà</w:t>
+      </w:r>
+      <w:r>
+        <w:rPr>
+          <w:rFonts w:ascii="Times New Roman" w:hAnsi="Times New Roman" w:cs="Times New Roman"/>
+          <w:sz w:val="26"/>
+          <w:szCs w:val="26"/>
+        </w:rPr>
+        <w:t xml:space="preserve"> sáng tạo nội dung</w:t>
+      </w:r>
+      <w:r>
+        <w:rPr>
+          <w:rFonts w:ascii="Times New Roman" w:hAnsi="Times New Roman" w:cs="Times New Roman"/>
+          <w:sz w:val="26"/>
+          <w:szCs w:val="26"/>
+        </w:rPr>
+        <w:t>: Khi mua gói Pro sẽ được phép đăng tải không giới hạn thời lượng nhạc,thêm các tính năng dành riêng cho tài khoản Pro</w:t>
+      </w:r>
+    </w:p>
+    <w:p>
+      <w:pPr>
+        <w:rPr>
+          <w:rFonts w:ascii="Times New Roman" w:eastAsia="Times New Roman" w:hAnsi="Times New Roman" w:cs="Times New Roman"/>
+          <w:b/>
+          <w:bCs/>
+          <w:sz w:val="26"/>
+          <w:szCs w:val="26"/>
+        </w:rPr>
+      </w:pPr>
+      <w:r>
+        <w:rPr>
+          <w:rFonts w:ascii="Times New Roman" w:eastAsia="Times New Roman" w:hAnsi="Times New Roman" w:cs="Times New Roman"/>
+          <w:b/>
+          <w:bCs/>
+          <w:sz w:val="26"/>
+          <w:szCs w:val="26"/>
+        </w:rPr>
+        <w:br w:type="page"/>
+      </w:r>
+    </w:p>
+    <w:p>
+      <w:pPr>
+        <w:spacing w:before="120" w:after="120" w:line="288" w:lineRule="auto"/>
+        <w:outlineLvl w:val="1"/>
+        <w:rPr>
+          <w:rFonts w:ascii="Times New Roman" w:eastAsia="Times New Roman" w:hAnsi="Times New Roman" w:cs="Times New Roman"/>
+          <w:b/>
+          <w:bCs/>
+          <w:sz w:val="26"/>
+          <w:szCs w:val="26"/>
+        </w:rPr>
+      </w:pPr>
+      <w:r>
+        <w:rPr>
+          <w:rFonts w:ascii="Times New Roman" w:eastAsia="Times New Roman" w:hAnsi="Times New Roman" w:cs="Times New Roman"/>
+          <w:b/>
+          <w:bCs/>
+          <w:sz w:val="26"/>
+          <w:szCs w:val="26"/>
+        </w:rPr>
+        <w:lastRenderedPageBreak/>
+        <w:t>2. Mục tiêu dự án (Yêu cầu viết theo tiêu chí SMART)</w:t>
+      </w:r>
+    </w:p>
+    <w:p>
+      <w:pPr>
         <w:numPr>
           <w:ilvl w:val="0"/>
           <w:numId w:val="14"/>
@@ -787,25 +924,11 @@
         <w:jc w:val="both"/>
         <w:rPr>
           <w:rFonts w:ascii="Times New Roman" w:eastAsia="Times New Roman" w:hAnsi="Times New Roman" w:cs="Times New Roman"/>
-          <w:bCs/>
           <w:sz w:val="26"/>
           <w:szCs w:val="26"/>
         </w:rPr>
       </w:pPr>
       <w:r>
-        <w:rPr>
-          <w:rFonts w:ascii="Times New Roman" w:eastAsia="Times New Roman" w:hAnsi="Times New Roman" w:cs="Times New Roman"/>
-          <w:bCs/>
-          <w:sz w:val="26"/>
-          <w:szCs w:val="26"/>
-        </w:rPr>
-        <w:t>Đối tượng khách hàng mục tiêu hoặc người hưởng lợi từ sản phẩm này là ai?</w:t>
-      </w:r>
-    </w:p>
-    <w:p>
-      <w:pPr>
-        <w:spacing w:before="120" w:after="120" w:line="288" w:lineRule="auto"/>
-        <w:outlineLvl w:val="1"/>
         <w:rPr>
           <w:rFonts w:ascii="Times New Roman" w:eastAsia="Times New Roman" w:hAnsi="Times New Roman" w:cs="Times New Roman"/>
           <w:b/>
@@ -813,16 +936,15 @@
           <w:sz w:val="26"/>
           <w:szCs w:val="26"/>
         </w:rPr>
-      </w:pPr>
+        <w:t>S (Specific - Cụ thể):</w:t>
+      </w:r>
       <w:r>
         <w:rPr>
           <w:rFonts w:ascii="Times New Roman" w:eastAsia="Times New Roman" w:hAnsi="Times New Roman" w:cs="Times New Roman"/>
-          <w:b/>
-          <w:bCs/>
-          <w:sz w:val="26"/>
-          <w:szCs w:val="26"/>
-        </w:rPr>
-        <w:t>2. Mục tiêu dự án (Yêu cầu viết theo tiêu chí SMART)</w:t>
+          <w:sz w:val="26"/>
+          <w:szCs w:val="26"/>
+        </w:rPr>
+        <w:t xml:space="preserve"> Sản phẩm cuối cùng của bài tập lớn là gì? (Ví dụ: Một website bán hàng, một bài báo cáo nghiên cứu thị trường, một bản thiết kế chiến dịch marketing...).</w:t>
       </w:r>
     </w:p>
     <w:p>
@@ -851,7 +973,7 @@
           <w:sz w:val="26"/>
           <w:szCs w:val="26"/>
         </w:rPr>
-        <w:t>S (Specific - Cụ thể):</w:t>
+        <w:t>M (Measurable - Đo lường được):</w:t>
       </w:r>
       <w:r>
         <w:rPr>
@@ -859,7 +981,7 @@
           <w:sz w:val="26"/>
           <w:szCs w:val="26"/>
         </w:rPr>
-        <w:t xml:space="preserve"> Sản phẩm cuối cùng của bài tập lớn là gì? (Ví dụ: Một website bán hàng, một bài báo cáo nghiên cứu thị trường, một bản thiết kế chiến dịch marketing...).</w:t>
+        <w:t xml:space="preserve"> Các chỉ số kỹ thuật hoặc tiêu chí định lượng (Ví dụ: Website có tối thiểu 5 tính năng; Bài báo cáo dài 30 trang; Khảo sát được ít nhất 100 mẫu...).</w:t>
       </w:r>
     </w:p>
     <w:p>
@@ -888,7 +1010,7 @@
           <w:sz w:val="26"/>
           <w:szCs w:val="26"/>
         </w:rPr>
-        <w:t>M (Measurable - Đo lường được):</w:t>
+        <w:t>A (Achievable - Khả thi):</w:t>
       </w:r>
       <w:r>
         <w:rPr>
@@ -896,7 +1018,7 @@
           <w:sz w:val="26"/>
           <w:szCs w:val="26"/>
         </w:rPr>
-        <w:t xml:space="preserve"> Các chỉ số kỹ thuật hoặc tiêu chí định lượng (Ví dụ: Website có tối thiểu 5 tính năng; Bài báo cáo dài 30 trang; Khảo sát được ít nhất 100 mẫu...).</w:t>
+        <w:t xml:space="preserve"> Tại sao nhóm tự tin có thể làm được? (Dựa trên kiến thức đã học, công cụ miễn phí có sẵn...).</w:t>
       </w:r>
     </w:p>
     <w:p>
@@ -925,44 +1047,6 @@
           <w:sz w:val="26"/>
           <w:szCs w:val="26"/>
         </w:rPr>
-        <w:t>A (Achievable - Khả thi):</w:t>
-      </w:r>
-      <w:r>
-        <w:rPr>
-          <w:rFonts w:ascii="Times New Roman" w:eastAsia="Times New Roman" w:hAnsi="Times New Roman" w:cs="Times New Roman"/>
-          <w:sz w:val="26"/>
-          <w:szCs w:val="26"/>
-        </w:rPr>
-        <w:t xml:space="preserve"> Tại sao nhóm tự tin có thể làm được? (Dựa trên kiến thức đã học, công cụ miễn phí có sẵn...).</w:t>
-      </w:r>
-    </w:p>
-    <w:p>
-      <w:pPr>
-        <w:numPr>
-          <w:ilvl w:val="0"/>
-          <w:numId w:val="14"/>
-        </w:numPr>
-        <w:tabs>
-          <w:tab w:val="clear" w:pos="720"/>
-        </w:tabs>
-        <w:spacing w:before="120" w:after="120" w:line="288" w:lineRule="auto"/>
-        <w:ind w:left="0" w:firstLine="426"/>
-        <w:jc w:val="both"/>
-        <w:rPr>
-          <w:rFonts w:ascii="Times New Roman" w:eastAsia="Times New Roman" w:hAnsi="Times New Roman" w:cs="Times New Roman"/>
-          <w:sz w:val="26"/>
-          <w:szCs w:val="26"/>
-        </w:rPr>
-      </w:pPr>
-      <w:r>
-        <w:rPr>
-          <w:rFonts w:ascii="Times New Roman" w:eastAsia="Times New Roman" w:hAnsi="Times New Roman" w:cs="Times New Roman"/>
-          <w:b/>
-          <w:bCs/>
-          <w:sz w:val="26"/>
-          <w:szCs w:val="26"/>
-        </w:rPr>
-        <w:lastRenderedPageBreak/>
         <w:t>R (Relevant - Thực tế):</w:t>
       </w:r>
       <w:r>
@@ -1700,7 +1784,15 @@
                 <w:sz w:val="26"/>
                 <w:szCs w:val="26"/>
               </w:rPr>
-              <w:t>13/10</w:t>
+              <w:t>12</w:t>
+            </w:r>
+            <w:r>
+              <w:rPr>
+                <w:rFonts w:ascii="Times New Roman" w:eastAsia="Times New Roman" w:hAnsi="Times New Roman" w:cs="Times New Roman"/>
+                <w:sz w:val="26"/>
+                <w:szCs w:val="26"/>
+              </w:rPr>
+              <w:t>/10</w:t>
             </w:r>
           </w:p>
         </w:tc>
@@ -1998,6 +2090,14 @@
                 <w:szCs w:val="26"/>
               </w:rPr>
             </w:pPr>
+            <w:r>
+              <w:rPr>
+                <w:rFonts w:ascii="Times New Roman" w:eastAsia="Times New Roman" w:hAnsi="Times New Roman" w:cs="Times New Roman"/>
+                <w:sz w:val="26"/>
+                <w:szCs w:val="26"/>
+              </w:rPr>
+              <w:t>Xong</w:t>
+            </w:r>
           </w:p>
         </w:tc>
       </w:tr>
@@ -6114,6 +6214,119 @@
     </w:lvl>
   </w:abstractNum>
   <w:abstractNum w:abstractNumId="9" w15:restartNumberingAfterBreak="0">
+    <w:nsid w:val="48275628"/>
+    <w:multiLevelType w:val="hybridMultilevel"/>
+    <w:tmpl w:val="25E2A1F4"/>
+    <w:lvl w:ilvl="0" w:tplc="0409000B">
+      <w:start w:val="1"/>
+      <w:numFmt w:val="bullet"/>
+      <w:lvlText w:val=""/>
+      <w:lvlJc w:val="left"/>
+      <w:pPr>
+        <w:ind w:left="720" w:hanging="360"/>
+      </w:pPr>
+      <w:rPr>
+        <w:rFonts w:ascii="Wingdings" w:hAnsi="Wingdings" w:hint="default"/>
+      </w:rPr>
+    </w:lvl>
+    <w:lvl w:ilvl="1" w:tplc="04090003" w:tentative="1">
+      <w:start w:val="1"/>
+      <w:numFmt w:val="bullet"/>
+      <w:lvlText w:val="o"/>
+      <w:lvlJc w:val="left"/>
+      <w:pPr>
+        <w:ind w:left="1440" w:hanging="360"/>
+      </w:pPr>
+      <w:rPr>
+        <w:rFonts w:ascii="Courier New" w:hAnsi="Courier New" w:cs="Courier New" w:hint="default"/>
+      </w:rPr>
+    </w:lvl>
+    <w:lvl w:ilvl="2" w:tplc="04090005" w:tentative="1">
+      <w:start w:val="1"/>
+      <w:numFmt w:val="bullet"/>
+      <w:lvlText w:val=""/>
+      <w:lvlJc w:val="left"/>
+      <w:pPr>
+        <w:ind w:left="2160" w:hanging="360"/>
+      </w:pPr>
+      <w:rPr>
+        <w:rFonts w:ascii="Wingdings" w:hAnsi="Wingdings" w:hint="default"/>
+      </w:rPr>
+    </w:lvl>
+    <w:lvl w:ilvl="3" w:tplc="04090001" w:tentative="1">
+      <w:start w:val="1"/>
+      <w:numFmt w:val="bullet"/>
+      <w:lvlText w:val=""/>
+      <w:lvlJc w:val="left"/>
+      <w:pPr>
+        <w:ind w:left="2880" w:hanging="360"/>
+      </w:pPr>
+      <w:rPr>
+        <w:rFonts w:ascii="Symbol" w:hAnsi="Symbol" w:hint="default"/>
+      </w:rPr>
+    </w:lvl>
+    <w:lvl w:ilvl="4" w:tplc="04090003" w:tentative="1">
+      <w:start w:val="1"/>
+      <w:numFmt w:val="bullet"/>
+      <w:lvlText w:val="o"/>
+      <w:lvlJc w:val="left"/>
+      <w:pPr>
+        <w:ind w:left="3600" w:hanging="360"/>
+      </w:pPr>
+      <w:rPr>
+        <w:rFonts w:ascii="Courier New" w:hAnsi="Courier New" w:cs="Courier New" w:hint="default"/>
+      </w:rPr>
+    </w:lvl>
+    <w:lvl w:ilvl="5" w:tplc="04090005" w:tentative="1">
+      <w:start w:val="1"/>
+      <w:numFmt w:val="bullet"/>
+      <w:lvlText w:val=""/>
+      <w:lvlJc w:val="left"/>
+      <w:pPr>
+        <w:ind w:left="4320" w:hanging="360"/>
+      </w:pPr>
+      <w:rPr>
+        <w:rFonts w:ascii="Wingdings" w:hAnsi="Wingdings" w:hint="default"/>
+      </w:rPr>
+    </w:lvl>
+    <w:lvl w:ilvl="6" w:tplc="04090001" w:tentative="1">
+      <w:start w:val="1"/>
+      <w:numFmt w:val="bullet"/>
+      <w:lvlText w:val=""/>
+      <w:lvlJc w:val="left"/>
+      <w:pPr>
+        <w:ind w:left="5040" w:hanging="360"/>
+      </w:pPr>
+      <w:rPr>
+        <w:rFonts w:ascii="Symbol" w:hAnsi="Symbol" w:hint="default"/>
+      </w:rPr>
+    </w:lvl>
+    <w:lvl w:ilvl="7" w:tplc="04090003" w:tentative="1">
+      <w:start w:val="1"/>
+      <w:numFmt w:val="bullet"/>
+      <w:lvlText w:val="o"/>
+      <w:lvlJc w:val="left"/>
+      <w:pPr>
+        <w:ind w:left="5760" w:hanging="360"/>
+      </w:pPr>
+      <w:rPr>
+        <w:rFonts w:ascii="Courier New" w:hAnsi="Courier New" w:cs="Courier New" w:hint="default"/>
+      </w:rPr>
+    </w:lvl>
+    <w:lvl w:ilvl="8" w:tplc="04090005" w:tentative="1">
+      <w:start w:val="1"/>
+      <w:numFmt w:val="bullet"/>
+      <w:lvlText w:val=""/>
+      <w:lvlJc w:val="left"/>
+      <w:pPr>
+        <w:ind w:left="6480" w:hanging="360"/>
+      </w:pPr>
+      <w:rPr>
+        <w:rFonts w:ascii="Wingdings" w:hAnsi="Wingdings" w:hint="default"/>
+      </w:rPr>
+    </w:lvl>
+  </w:abstractNum>
+  <w:abstractNum w:abstractNumId="10" w15:restartNumberingAfterBreak="0">
     <w:nsid w:val="50B8657F"/>
     <w:multiLevelType w:val="multilevel"/>
     <w:tmpl w:val="FC5C04F8"/>
@@ -6262,7 +6475,7 @@
       </w:rPr>
     </w:lvl>
   </w:abstractNum>
-  <w:abstractNum w:abstractNumId="10" w15:restartNumberingAfterBreak="0">
+  <w:abstractNum w:abstractNumId="11" w15:restartNumberingAfterBreak="0">
     <w:nsid w:val="53246281"/>
     <w:multiLevelType w:val="multilevel"/>
     <w:tmpl w:val="564E5382"/>
@@ -6411,7 +6624,7 @@
       </w:rPr>
     </w:lvl>
   </w:abstractNum>
-  <w:abstractNum w:abstractNumId="11" w15:restartNumberingAfterBreak="0">
+  <w:abstractNum w:abstractNumId="12" w15:restartNumberingAfterBreak="0">
     <w:nsid w:val="5E69219F"/>
     <w:multiLevelType w:val="multilevel"/>
     <w:tmpl w:val="2A4033A0"/>
@@ -6560,7 +6773,7 @@
       </w:rPr>
     </w:lvl>
   </w:abstractNum>
-  <w:abstractNum w:abstractNumId="12" w15:restartNumberingAfterBreak="0">
+  <w:abstractNum w:abstractNumId="13" w15:restartNumberingAfterBreak="0">
     <w:nsid w:val="5FC1441D"/>
     <w:multiLevelType w:val="multilevel"/>
     <w:tmpl w:val="94EED6A8"/>
@@ -6709,7 +6922,7 @@
       </w:rPr>
     </w:lvl>
   </w:abstractNum>
-  <w:abstractNum w:abstractNumId="13" w15:restartNumberingAfterBreak="0">
+  <w:abstractNum w:abstractNumId="14" w15:restartNumberingAfterBreak="0">
     <w:nsid w:val="6B0E399A"/>
     <w:multiLevelType w:val="hybridMultilevel"/>
     <w:tmpl w:val="FA0AF02A"/>
@@ -6822,7 +7035,7 @@
       </w:rPr>
     </w:lvl>
   </w:abstractNum>
-  <w:abstractNum w:abstractNumId="14" w15:restartNumberingAfterBreak="0">
+  <w:abstractNum w:abstractNumId="15" w15:restartNumberingAfterBreak="0">
     <w:nsid w:val="6B3174FD"/>
     <w:multiLevelType w:val="multilevel"/>
     <w:tmpl w:val="CD70D830"/>
@@ -6936,7 +7149,7 @@
     </w:lvl>
   </w:abstractNum>
   <w:num w:numId="1" w16cid:durableId="1816532700">
-    <w:abstractNumId w:val="10"/>
+    <w:abstractNumId w:val="11"/>
   </w:num>
   <w:num w:numId="2" w16cid:durableId="90393430">
     <w:abstractNumId w:val="0"/>
@@ -6945,13 +7158,13 @@
     <w:abstractNumId w:val="6"/>
   </w:num>
   <w:num w:numId="4" w16cid:durableId="274481919">
-    <w:abstractNumId w:val="9"/>
+    <w:abstractNumId w:val="10"/>
   </w:num>
   <w:num w:numId="5" w16cid:durableId="498540710">
     <w:abstractNumId w:val="7"/>
   </w:num>
   <w:num w:numId="6" w16cid:durableId="1601794922">
-    <w:abstractNumId w:val="12"/>
+    <w:abstractNumId w:val="13"/>
   </w:num>
   <w:num w:numId="7" w16cid:durableId="1529759405">
     <w:abstractNumId w:val="3"/>
@@ -6972,13 +7185,16 @@
     <w:abstractNumId w:val="8"/>
   </w:num>
   <w:num w:numId="13" w16cid:durableId="664893415">
+    <w:abstractNumId w:val="15"/>
+  </w:num>
+  <w:num w:numId="14" w16cid:durableId="1337609054">
+    <w:abstractNumId w:val="12"/>
+  </w:num>
+  <w:num w:numId="15" w16cid:durableId="163982090">
     <w:abstractNumId w:val="14"/>
   </w:num>
-  <w:num w:numId="14" w16cid:durableId="1337609054">
-    <w:abstractNumId w:val="11"/>
-  </w:num>
-  <w:num w:numId="15" w16cid:durableId="163982090">
-    <w:abstractNumId w:val="13"/>
+  <w:num w:numId="16" w16cid:durableId="1556962925">
+    <w:abstractNumId w:val="9"/>
   </w:num>
 </w:numbering>
 </file>
@@ -7507,6 +7723,22 @@
       <w:contextualSpacing/>
     </w:pPr>
   </w:style>
+  <w:style w:type="paragraph" w:styleId="ThngthngWeb">
+    <w:name w:val="Normal (Web)"/>
+    <w:basedOn w:val="Binhthng"/>
+    <w:uiPriority w:val="99"/>
+    <w:semiHidden/>
+    <w:unhideWhenUsed/>
+    <w:rsid w:val="005164A5"/>
+    <w:pPr>
+      <w:spacing w:before="100" w:beforeAutospacing="1" w:after="100" w:afterAutospacing="1" w:line="240" w:lineRule="auto"/>
+    </w:pPr>
+    <w:rPr>
+      <w:rFonts w:ascii="Times New Roman" w:eastAsia="Times New Roman" w:hAnsi="Times New Roman" w:cs="Times New Roman"/>
+      <w:sz w:val="24"/>
+      <w:szCs w:val="24"/>
+    </w:rPr>
+  </w:style>
 </w:styles>
 </file>
 

</xml_diff>

<commit_message>
chinh sua phan I va phan II
</commit_message>
<xml_diff>
--- a/docs/KẾ HOẠCH THỰC BTL.docx
+++ b/docs/KẾ HOẠCH THỰC BTL.docx
@@ -926,6 +926,7 @@
           <w:rFonts w:ascii="Times New Roman" w:eastAsia="Times New Roman" w:hAnsi="Times New Roman" w:cs="Times New Roman"/>
           <w:sz w:val="26"/>
           <w:szCs w:val="26"/>
+          <w:highlight w:val="green"/>
         </w:rPr>
       </w:pPr>
       <w:r>
@@ -935,6 +936,7 @@
           <w:bCs/>
           <w:sz w:val="26"/>
           <w:szCs w:val="26"/>
+          <w:highlight w:val="green"/>
         </w:rPr>
         <w:t>S (Specific - Cụ thể):</w:t>
       </w:r>
@@ -943,12 +945,33 @@
           <w:rFonts w:ascii="Times New Roman" w:eastAsia="Times New Roman" w:hAnsi="Times New Roman" w:cs="Times New Roman"/>
           <w:sz w:val="26"/>
           <w:szCs w:val="26"/>
+          <w:highlight w:val="green"/>
         </w:rPr>
         <w:t xml:space="preserve"> Sản phẩm cuối cùng của bài tập lớn là gì? (Ví dụ: Một website bán hàng, một bài báo cáo nghiên cứu thị trường, một bản thiết kế chiến dịch marketing...).</w:t>
       </w:r>
     </w:p>
     <w:p>
       <w:pPr>
+        <w:spacing w:before="120" w:after="120" w:line="288" w:lineRule="auto"/>
+        <w:ind w:firstLine="426"/>
+        <w:jc w:val="both"/>
+        <w:rPr>
+          <w:rFonts w:ascii="Times New Roman" w:eastAsia="Times New Roman" w:hAnsi="Times New Roman" w:cs="Times New Roman"/>
+          <w:sz w:val="26"/>
+          <w:szCs w:val="26"/>
+        </w:rPr>
+      </w:pPr>
+      <w:r>
+        <w:rPr>
+          <w:rFonts w:ascii="Times New Roman" w:eastAsia="Times New Roman" w:hAnsi="Times New Roman" w:cs="Times New Roman"/>
+          <w:sz w:val="26"/>
+          <w:szCs w:val="26"/>
+        </w:rPr>
+        <w:t>Sản phẩm cuối cùng của bài tập lớn là một Web-app nghe nhạc trực tuyến hoàn chỉnh, cho phép người dùng nghe nhạc mượt mà không ngắt quãng khi chuyển trang, tạo/quản lý danh sách phát cá nhân, tìm kiếm bài hát và đăng ký gói tài khoản VIP/Artist; đồng thời cung cấp giao diện quản trị cho Admin để quản lý dữ liệu âm nhạc và phân quyền người dùng.</w:t>
+      </w:r>
+    </w:p>
+    <w:p>
+      <w:pPr>
         <w:numPr>
           <w:ilvl w:val="0"/>
           <w:numId w:val="14"/>
@@ -963,6 +986,7 @@
           <w:rFonts w:ascii="Times New Roman" w:eastAsia="Times New Roman" w:hAnsi="Times New Roman" w:cs="Times New Roman"/>
           <w:sz w:val="26"/>
           <w:szCs w:val="26"/>
+          <w:highlight w:val="yellow"/>
         </w:rPr>
       </w:pPr>
       <w:r>
@@ -972,6 +996,7 @@
           <w:bCs/>
           <w:sz w:val="26"/>
           <w:szCs w:val="26"/>
+          <w:highlight w:val="yellow"/>
         </w:rPr>
         <w:t>M (Measurable - Đo lường được):</w:t>
       </w:r>
@@ -980,6 +1005,7 @@
           <w:rFonts w:ascii="Times New Roman" w:eastAsia="Times New Roman" w:hAnsi="Times New Roman" w:cs="Times New Roman"/>
           <w:sz w:val="26"/>
           <w:szCs w:val="26"/>
+          <w:highlight w:val="yellow"/>
         </w:rPr>
         <w:t xml:space="preserve"> Các chỉ số kỹ thuật hoặc tiêu chí định lượng (Ví dụ: Website có tối thiểu 5 tính năng; Bài báo cáo dài 30 trang; Khảo sát được ít nhất 100 mẫu...).</w:t>
       </w:r>
@@ -1000,6 +1026,7 @@
           <w:rFonts w:ascii="Times New Roman" w:eastAsia="Times New Roman" w:hAnsi="Times New Roman" w:cs="Times New Roman"/>
           <w:sz w:val="26"/>
           <w:szCs w:val="26"/>
+          <w:highlight w:val="green"/>
         </w:rPr>
       </w:pPr>
       <w:r>
@@ -1009,6 +1036,7 @@
           <w:bCs/>
           <w:sz w:val="26"/>
           <w:szCs w:val="26"/>
+          <w:highlight w:val="green"/>
         </w:rPr>
         <w:t>A (Achievable - Khả thi):</w:t>
       </w:r>
@@ -1017,12 +1045,33 @@
           <w:rFonts w:ascii="Times New Roman" w:eastAsia="Times New Roman" w:hAnsi="Times New Roman" w:cs="Times New Roman"/>
           <w:sz w:val="26"/>
           <w:szCs w:val="26"/>
+          <w:highlight w:val="green"/>
         </w:rPr>
         <w:t xml:space="preserve"> Tại sao nhóm tự tin có thể làm được? (Dựa trên kiến thức đã học, công cụ miễn phí có sẵn...).</w:t>
       </w:r>
     </w:p>
     <w:p>
       <w:pPr>
+        <w:spacing w:before="120" w:after="120" w:line="288" w:lineRule="auto"/>
+        <w:ind w:firstLine="426"/>
+        <w:jc w:val="both"/>
+        <w:rPr>
+          <w:rFonts w:ascii="Times New Roman" w:eastAsia="Times New Roman" w:hAnsi="Times New Roman" w:cs="Times New Roman"/>
+          <w:sz w:val="26"/>
+          <w:szCs w:val="26"/>
+        </w:rPr>
+      </w:pPr>
+      <w:r>
+        <w:rPr>
+          <w:rFonts w:ascii="Times New Roman" w:eastAsia="Times New Roman" w:hAnsi="Times New Roman" w:cs="Times New Roman"/>
+          <w:sz w:val="26"/>
+          <w:szCs w:val="26"/>
+        </w:rPr>
+        <w:t>Dự án khả thi do khối lượng chức năng được giới hạn ở mức vừa phải; nhóm có thể vừa làm vừa học, tận dụng các tài liệu hướng dẫn, mẫu code sẵn có trên mạng và các công cụ AI hỗ trợ lập trình để từng bước hoàn thiện sản phẩm.</w:t>
+      </w:r>
+    </w:p>
+    <w:p>
+      <w:pPr>
         <w:numPr>
           <w:ilvl w:val="0"/>
           <w:numId w:val="14"/>
@@ -1037,6 +1086,7 @@
           <w:rFonts w:ascii="Times New Roman" w:eastAsia="Times New Roman" w:hAnsi="Times New Roman" w:cs="Times New Roman"/>
           <w:sz w:val="26"/>
           <w:szCs w:val="26"/>
+          <w:highlight w:val="green"/>
         </w:rPr>
       </w:pPr>
       <w:r>
@@ -1046,6 +1096,7 @@
           <w:bCs/>
           <w:sz w:val="26"/>
           <w:szCs w:val="26"/>
+          <w:highlight w:val="green"/>
         </w:rPr>
         <w:t>R (Relevant - Thực tế):</w:t>
       </w:r>
@@ -1054,6 +1105,7 @@
           <w:rFonts w:ascii="Times New Roman" w:eastAsia="Times New Roman" w:hAnsi="Times New Roman" w:cs="Times New Roman"/>
           <w:sz w:val="26"/>
           <w:szCs w:val="26"/>
+          <w:highlight w:val="green"/>
         </w:rPr>
         <w:t xml:space="preserve"> Dự án này giúp nhóm giải quyết được chuẩn đầu ra nào của môn học?</w:t>
       </w:r>
@@ -1074,6 +1126,7 @@
           <w:rFonts w:ascii="Times New Roman" w:eastAsia="Times New Roman" w:hAnsi="Times New Roman" w:cs="Times New Roman"/>
           <w:sz w:val="26"/>
           <w:szCs w:val="26"/>
+          <w:highlight w:val="yellow"/>
         </w:rPr>
       </w:pPr>
       <w:r>
@@ -1083,6 +1136,7 @@
           <w:bCs/>
           <w:sz w:val="26"/>
           <w:szCs w:val="26"/>
+          <w:highlight w:val="yellow"/>
         </w:rPr>
         <w:t>T (Time-bound - Thời hạn):</w:t>
       </w:r>
@@ -1091,6 +1145,7 @@
           <w:rFonts w:ascii="Times New Roman" w:eastAsia="Times New Roman" w:hAnsi="Times New Roman" w:cs="Times New Roman"/>
           <w:sz w:val="26"/>
           <w:szCs w:val="26"/>
+          <w:highlight w:val="yellow"/>
         </w:rPr>
         <w:t xml:space="preserve"> Hạn chót hoàn thành và nộp bài cho Giảng viên là ngày nào?</w:t>
       </w:r>
@@ -1521,27 +1576,61 @@
               </w:rPr>
             </w:pPr>
           </w:p>
-        </w:tc>
-        <w:tc>
-          <w:tcPr>
-            <w:tcW w:w="0" w:type="auto"/>
-            <w:tcMar>
-              <w:top w:w="100" w:type="dxa"/>
-              <w:left w:w="100" w:type="dxa"/>
-              <w:bottom w:w="100" w:type="dxa"/>
-              <w:right w:w="100" w:type="dxa"/>
-            </w:tcMar>
-            <w:hideMark/>
-          </w:tcPr>
-          <w:p>
-            <w:pPr>
-              <w:spacing w:after="0" w:line="240" w:lineRule="auto"/>
-              <w:rPr>
-                <w:rFonts w:ascii="Times New Roman" w:eastAsia="Times New Roman" w:hAnsi="Times New Roman" w:cs="Times New Roman"/>
-                <w:sz w:val="26"/>
-                <w:szCs w:val="26"/>
-              </w:rPr>
-            </w:pPr>
+          <w:p>
+            <w:pPr>
+              <w:rPr>
+                <w:rFonts w:ascii="Times New Roman" w:eastAsia="Times New Roman" w:hAnsi="Times New Roman" w:cs="Times New Roman"/>
+                <w:sz w:val="26"/>
+                <w:szCs w:val="26"/>
+              </w:rPr>
+            </w:pPr>
+            <w:r>
+              <w:rPr>
+                <w:rFonts w:ascii="Times New Roman" w:eastAsia="Times New Roman" w:hAnsi="Times New Roman" w:cs="Times New Roman"/>
+                <w:sz w:val="26"/>
+                <w:szCs w:val="26"/>
+              </w:rPr>
+              <w:t>Đào Huy Hoàng</w:t>
+            </w:r>
+          </w:p>
+          <w:p>
+            <w:pPr>
+              <w:rPr>
+                <w:rFonts w:ascii="Times New Roman" w:eastAsia="Times New Roman" w:hAnsi="Times New Roman" w:cs="Times New Roman"/>
+                <w:sz w:val="26"/>
+                <w:szCs w:val="26"/>
+              </w:rPr>
+            </w:pPr>
+          </w:p>
+        </w:tc>
+        <w:tc>
+          <w:tcPr>
+            <w:tcW w:w="0" w:type="auto"/>
+            <w:tcMar>
+              <w:top w:w="100" w:type="dxa"/>
+              <w:left w:w="100" w:type="dxa"/>
+              <w:bottom w:w="100" w:type="dxa"/>
+              <w:right w:w="100" w:type="dxa"/>
+            </w:tcMar>
+            <w:hideMark/>
+          </w:tcPr>
+          <w:p>
+            <w:pPr>
+              <w:spacing w:after="0" w:line="240" w:lineRule="auto"/>
+              <w:rPr>
+                <w:rFonts w:ascii="Times New Roman" w:eastAsia="Times New Roman" w:hAnsi="Times New Roman" w:cs="Times New Roman"/>
+                <w:sz w:val="26"/>
+                <w:szCs w:val="26"/>
+              </w:rPr>
+            </w:pPr>
+            <w:r>
+              <w:rPr>
+                <w:rFonts w:ascii="Times New Roman" w:eastAsia="Times New Roman" w:hAnsi="Times New Roman" w:cs="Times New Roman"/>
+                <w:sz w:val="26"/>
+                <w:szCs w:val="26"/>
+              </w:rPr>
+              <w:t>12/10</w:t>
+            </w:r>
           </w:p>
         </w:tc>
         <w:tc>
@@ -2096,7 +2185,7 @@
                 <w:sz w:val="26"/>
                 <w:szCs w:val="26"/>
               </w:rPr>
-              <w:t>Xong</w:t>
+              <w:t>Đang làm</w:t>
             </w:r>
           </w:p>
         </w:tc>
@@ -2404,37 +2493,69 @@
                 <w:sz w:val="26"/>
                 <w:szCs w:val="26"/>
               </w:rPr>
-              <w:t>.../...</w:t>
-            </w:r>
-          </w:p>
-        </w:tc>
-        <w:tc>
-          <w:tcPr>
-            <w:tcW w:w="0" w:type="auto"/>
-            <w:tcMar>
-              <w:top w:w="100" w:type="dxa"/>
-              <w:left w:w="100" w:type="dxa"/>
-              <w:bottom w:w="100" w:type="dxa"/>
-              <w:right w:w="100" w:type="dxa"/>
-            </w:tcMar>
-            <w:hideMark/>
-          </w:tcPr>
-          <w:p>
-            <w:pPr>
-              <w:spacing w:after="0" w:line="240" w:lineRule="auto"/>
-              <w:rPr>
-                <w:rFonts w:ascii="Times New Roman" w:eastAsia="Times New Roman" w:hAnsi="Times New Roman" w:cs="Times New Roman"/>
-                <w:sz w:val="26"/>
-                <w:szCs w:val="26"/>
-              </w:rPr>
-            </w:pPr>
-            <w:r>
-              <w:rPr>
-                <w:rFonts w:ascii="Times New Roman" w:eastAsia="Times New Roman" w:hAnsi="Times New Roman" w:cs="Times New Roman"/>
-                <w:sz w:val="26"/>
-                <w:szCs w:val="26"/>
-              </w:rPr>
-              <w:t>.../...</w:t>
+              <w:t>14</w:t>
+            </w:r>
+            <w:r>
+              <w:rPr>
+                <w:rFonts w:ascii="Times New Roman" w:eastAsia="Times New Roman" w:hAnsi="Times New Roman" w:cs="Times New Roman"/>
+                <w:sz w:val="26"/>
+                <w:szCs w:val="26"/>
+              </w:rPr>
+              <w:t>/</w:t>
+            </w:r>
+            <w:r>
+              <w:rPr>
+                <w:rFonts w:ascii="Times New Roman" w:eastAsia="Times New Roman" w:hAnsi="Times New Roman" w:cs="Times New Roman"/>
+                <w:sz w:val="26"/>
+                <w:szCs w:val="26"/>
+              </w:rPr>
+              <w:t>10</w:t>
+            </w:r>
+          </w:p>
+        </w:tc>
+        <w:tc>
+          <w:tcPr>
+            <w:tcW w:w="0" w:type="auto"/>
+            <w:tcMar>
+              <w:top w:w="100" w:type="dxa"/>
+              <w:left w:w="100" w:type="dxa"/>
+              <w:bottom w:w="100" w:type="dxa"/>
+              <w:right w:w="100" w:type="dxa"/>
+            </w:tcMar>
+            <w:hideMark/>
+          </w:tcPr>
+          <w:p>
+            <w:pPr>
+              <w:spacing w:after="0" w:line="240" w:lineRule="auto"/>
+              <w:rPr>
+                <w:rFonts w:ascii="Times New Roman" w:eastAsia="Times New Roman" w:hAnsi="Times New Roman" w:cs="Times New Roman"/>
+                <w:sz w:val="26"/>
+                <w:szCs w:val="26"/>
+              </w:rPr>
+            </w:pPr>
+            <w:r>
+              <w:rPr>
+                <w:rFonts w:ascii="Times New Roman" w:eastAsia="Times New Roman" w:hAnsi="Times New Roman" w:cs="Times New Roman"/>
+                <w:sz w:val="26"/>
+                <w:szCs w:val="26"/>
+              </w:rPr>
+              <w:t>15</w:t>
+            </w:r>
+            <w:r>
+              <w:rPr>
+                <w:rFonts w:ascii="Times New Roman" w:eastAsia="Times New Roman" w:hAnsi="Times New Roman" w:cs="Times New Roman"/>
+                <w:sz w:val="26"/>
+                <w:szCs w:val="26"/>
+              </w:rPr>
+              <w:t>/</w:t>
+            </w:r>
+            <w:r>
+              <w:rPr>
+                <w:rFonts w:ascii="Times New Roman" w:eastAsia="Times New Roman" w:hAnsi="Times New Roman" w:cs="Times New Roman"/>
+                <w:sz w:val="26"/>
+                <w:szCs w:val="26"/>
+              </w:rPr>
+              <w:t>10</w:t>
             </w:r>
           </w:p>
         </w:tc>
@@ -2608,7 +2729,23 @@
                 <w:sz w:val="26"/>
                 <w:szCs w:val="26"/>
               </w:rPr>
-              <w:t>.../...</w:t>
+              <w:t>17</w:t>
+            </w:r>
+            <w:r>
+              <w:rPr>
+                <w:rFonts w:ascii="Times New Roman" w:eastAsia="Times New Roman" w:hAnsi="Times New Roman" w:cs="Times New Roman"/>
+                <w:sz w:val="26"/>
+                <w:szCs w:val="26"/>
+              </w:rPr>
+              <w:t>/</w:t>
+            </w:r>
+            <w:r>
+              <w:rPr>
+                <w:rFonts w:ascii="Times New Roman" w:eastAsia="Times New Roman" w:hAnsi="Times New Roman" w:cs="Times New Roman"/>
+                <w:sz w:val="26"/>
+                <w:szCs w:val="26"/>
+              </w:rPr>
+              <w:t>10</w:t>
             </w:r>
           </w:p>
         </w:tc>

</xml_diff>

<commit_message>
cap nhat them ke hoach
</commit_message>
<xml_diff>
--- a/docs/KẾ HOẠCH THỰC BTL.docx
+++ b/docs/KẾ HOẠCH THỰC BTL.docx
@@ -1707,6 +1707,14 @@
                 <w:szCs w:val="26"/>
               </w:rPr>
             </w:pPr>
+            <w:r>
+              <w:rPr>
+                <w:rFonts w:ascii="Times New Roman" w:eastAsia="Times New Roman" w:hAnsi="Times New Roman" w:cs="Times New Roman"/>
+                <w:sz w:val="26"/>
+                <w:szCs w:val="26"/>
+              </w:rPr>
+              <w:t>Xong</w:t>
+            </w:r>
           </w:p>
         </w:tc>
       </w:tr>
@@ -2539,7 +2547,7 @@
                 <w:sz w:val="26"/>
                 <w:szCs w:val="26"/>
               </w:rPr>
-              <w:t>15</w:t>
+              <w:t>19</w:t>
             </w:r>
             <w:r>
               <w:rPr>
@@ -2609,6 +2617,14 @@
                 <w:szCs w:val="26"/>
               </w:rPr>
             </w:pPr>
+            <w:r>
+              <w:rPr>
+                <w:rFonts w:ascii="Times New Roman" w:eastAsia="Times New Roman" w:hAnsi="Times New Roman" w:cs="Times New Roman"/>
+                <w:sz w:val="26"/>
+                <w:szCs w:val="26"/>
+              </w:rPr>
+              <w:t>Đang làm</w:t>
+            </w:r>
           </w:p>
         </w:tc>
       </w:tr>
@@ -2729,7 +2745,7 @@
                 <w:sz w:val="26"/>
                 <w:szCs w:val="26"/>
               </w:rPr>
-              <w:t>17</w:t>
+              <w:t>20</w:t>
             </w:r>
             <w:r>
               <w:rPr>
@@ -2775,7 +2791,23 @@
                 <w:sz w:val="26"/>
                 <w:szCs w:val="26"/>
               </w:rPr>
-              <w:t>.../...</w:t>
+              <w:t>26</w:t>
+            </w:r>
+            <w:r>
+              <w:rPr>
+                <w:rFonts w:ascii="Times New Roman" w:eastAsia="Times New Roman" w:hAnsi="Times New Roman" w:cs="Times New Roman"/>
+                <w:sz w:val="26"/>
+                <w:szCs w:val="26"/>
+              </w:rPr>
+              <w:t>/</w:t>
+            </w:r>
+            <w:r>
+              <w:rPr>
+                <w:rFonts w:ascii="Times New Roman" w:eastAsia="Times New Roman" w:hAnsi="Times New Roman" w:cs="Times New Roman"/>
+                <w:sz w:val="26"/>
+                <w:szCs w:val="26"/>
+              </w:rPr>
+              <w:t>11</w:t>
             </w:r>
           </w:p>
         </w:tc>
@@ -2829,6 +2861,14 @@
                 <w:szCs w:val="26"/>
               </w:rPr>
             </w:pPr>
+            <w:r>
+              <w:rPr>
+                <w:rFonts w:ascii="Times New Roman" w:eastAsia="Times New Roman" w:hAnsi="Times New Roman" w:cs="Times New Roman"/>
+                <w:sz w:val="26"/>
+                <w:szCs w:val="26"/>
+              </w:rPr>
+              <w:t>Đang làm</w:t>
+            </w:r>
           </w:p>
         </w:tc>
       </w:tr>
@@ -3145,37 +3185,77 @@
                 <w:sz w:val="26"/>
                 <w:szCs w:val="26"/>
               </w:rPr>
-              <w:t>.../...</w:t>
-            </w:r>
-          </w:p>
-        </w:tc>
-        <w:tc>
-          <w:tcPr>
-            <w:tcW w:w="0" w:type="auto"/>
-            <w:tcMar>
-              <w:top w:w="100" w:type="dxa"/>
-              <w:left w:w="100" w:type="dxa"/>
-              <w:bottom w:w="100" w:type="dxa"/>
-              <w:right w:w="100" w:type="dxa"/>
-            </w:tcMar>
-            <w:hideMark/>
-          </w:tcPr>
-          <w:p>
-            <w:pPr>
-              <w:spacing w:after="0" w:line="240" w:lineRule="auto"/>
-              <w:rPr>
-                <w:rFonts w:ascii="Times New Roman" w:eastAsia="Times New Roman" w:hAnsi="Times New Roman" w:cs="Times New Roman"/>
-                <w:sz w:val="26"/>
-                <w:szCs w:val="26"/>
-              </w:rPr>
-            </w:pPr>
-            <w:r>
-              <w:rPr>
-                <w:rFonts w:ascii="Times New Roman" w:eastAsia="Times New Roman" w:hAnsi="Times New Roman" w:cs="Times New Roman"/>
-                <w:sz w:val="26"/>
-                <w:szCs w:val="26"/>
-              </w:rPr>
-              <w:t>.../...</w:t>
+              <w:t>27</w:t>
+            </w:r>
+            <w:r>
+              <w:rPr>
+                <w:rFonts w:ascii="Times New Roman" w:eastAsia="Times New Roman" w:hAnsi="Times New Roman" w:cs="Times New Roman"/>
+                <w:sz w:val="26"/>
+                <w:szCs w:val="26"/>
+              </w:rPr>
+              <w:t>/</w:t>
+            </w:r>
+            <w:r>
+              <w:rPr>
+                <w:rFonts w:ascii="Times New Roman" w:eastAsia="Times New Roman" w:hAnsi="Times New Roman" w:cs="Times New Roman"/>
+                <w:sz w:val="26"/>
+                <w:szCs w:val="26"/>
+              </w:rPr>
+              <w:t>1</w:t>
+            </w:r>
+            <w:r>
+              <w:rPr>
+                <w:rFonts w:ascii="Times New Roman" w:eastAsia="Times New Roman" w:hAnsi="Times New Roman" w:cs="Times New Roman"/>
+                <w:sz w:val="26"/>
+                <w:szCs w:val="26"/>
+              </w:rPr>
+              <w:t>1</w:t>
+            </w:r>
+          </w:p>
+        </w:tc>
+        <w:tc>
+          <w:tcPr>
+            <w:tcW w:w="0" w:type="auto"/>
+            <w:tcMar>
+              <w:top w:w="100" w:type="dxa"/>
+              <w:left w:w="100" w:type="dxa"/>
+              <w:bottom w:w="100" w:type="dxa"/>
+              <w:right w:w="100" w:type="dxa"/>
+            </w:tcMar>
+            <w:hideMark/>
+          </w:tcPr>
+          <w:p>
+            <w:pPr>
+              <w:spacing w:after="0" w:line="240" w:lineRule="auto"/>
+              <w:rPr>
+                <w:rFonts w:ascii="Times New Roman" w:eastAsia="Times New Roman" w:hAnsi="Times New Roman" w:cs="Times New Roman"/>
+                <w:sz w:val="26"/>
+                <w:szCs w:val="26"/>
+              </w:rPr>
+            </w:pPr>
+            <w:r>
+              <w:rPr>
+                <w:rFonts w:ascii="Times New Roman" w:eastAsia="Times New Roman" w:hAnsi="Times New Roman" w:cs="Times New Roman"/>
+                <w:sz w:val="26"/>
+                <w:szCs w:val="26"/>
+              </w:rPr>
+              <w:t>1</w:t>
+            </w:r>
+            <w:r>
+              <w:rPr>
+                <w:rFonts w:ascii="Times New Roman" w:eastAsia="Times New Roman" w:hAnsi="Times New Roman" w:cs="Times New Roman"/>
+                <w:sz w:val="26"/>
+                <w:szCs w:val="26"/>
+              </w:rPr>
+              <w:t>/</w:t>
+            </w:r>
+            <w:r>
+              <w:rPr>
+                <w:rFonts w:ascii="Times New Roman" w:eastAsia="Times New Roman" w:hAnsi="Times New Roman" w:cs="Times New Roman"/>
+                <w:sz w:val="26"/>
+                <w:szCs w:val="26"/>
+              </w:rPr>
+              <w:t>12</w:t>
             </w:r>
           </w:p>
         </w:tc>
@@ -3349,37 +3429,69 @@
                 <w:sz w:val="26"/>
                 <w:szCs w:val="26"/>
               </w:rPr>
-              <w:t>.../...</w:t>
-            </w:r>
-          </w:p>
-        </w:tc>
-        <w:tc>
-          <w:tcPr>
-            <w:tcW w:w="0" w:type="auto"/>
-            <w:tcMar>
-              <w:top w:w="100" w:type="dxa"/>
-              <w:left w:w="100" w:type="dxa"/>
-              <w:bottom w:w="100" w:type="dxa"/>
-              <w:right w:w="100" w:type="dxa"/>
-            </w:tcMar>
-            <w:hideMark/>
-          </w:tcPr>
-          <w:p>
-            <w:pPr>
-              <w:spacing w:after="0" w:line="240" w:lineRule="auto"/>
-              <w:rPr>
-                <w:rFonts w:ascii="Times New Roman" w:eastAsia="Times New Roman" w:hAnsi="Times New Roman" w:cs="Times New Roman"/>
-                <w:sz w:val="26"/>
-                <w:szCs w:val="26"/>
-              </w:rPr>
-            </w:pPr>
-            <w:r>
-              <w:rPr>
-                <w:rFonts w:ascii="Times New Roman" w:eastAsia="Times New Roman" w:hAnsi="Times New Roman" w:cs="Times New Roman"/>
-                <w:sz w:val="26"/>
-                <w:szCs w:val="26"/>
-              </w:rPr>
-              <w:t>.../...</w:t>
+              <w:t>1</w:t>
+            </w:r>
+            <w:r>
+              <w:rPr>
+                <w:rFonts w:ascii="Times New Roman" w:eastAsia="Times New Roman" w:hAnsi="Times New Roman" w:cs="Times New Roman"/>
+                <w:sz w:val="26"/>
+                <w:szCs w:val="26"/>
+              </w:rPr>
+              <w:t>/</w:t>
+            </w:r>
+            <w:r>
+              <w:rPr>
+                <w:rFonts w:ascii="Times New Roman" w:eastAsia="Times New Roman" w:hAnsi="Times New Roman" w:cs="Times New Roman"/>
+                <w:sz w:val="26"/>
+                <w:szCs w:val="26"/>
+              </w:rPr>
+              <w:t>12</w:t>
+            </w:r>
+          </w:p>
+        </w:tc>
+        <w:tc>
+          <w:tcPr>
+            <w:tcW w:w="0" w:type="auto"/>
+            <w:tcMar>
+              <w:top w:w="100" w:type="dxa"/>
+              <w:left w:w="100" w:type="dxa"/>
+              <w:bottom w:w="100" w:type="dxa"/>
+              <w:right w:w="100" w:type="dxa"/>
+            </w:tcMar>
+            <w:hideMark/>
+          </w:tcPr>
+          <w:p>
+            <w:pPr>
+              <w:spacing w:after="0" w:line="240" w:lineRule="auto"/>
+              <w:rPr>
+                <w:rFonts w:ascii="Times New Roman" w:eastAsia="Times New Roman" w:hAnsi="Times New Roman" w:cs="Times New Roman"/>
+                <w:sz w:val="26"/>
+                <w:szCs w:val="26"/>
+              </w:rPr>
+            </w:pPr>
+            <w:r>
+              <w:rPr>
+                <w:rFonts w:ascii="Times New Roman" w:eastAsia="Times New Roman" w:hAnsi="Times New Roman" w:cs="Times New Roman"/>
+                <w:sz w:val="26"/>
+                <w:szCs w:val="26"/>
+              </w:rPr>
+              <w:t>3</w:t>
+            </w:r>
+            <w:r>
+              <w:rPr>
+                <w:rFonts w:ascii="Times New Roman" w:eastAsia="Times New Roman" w:hAnsi="Times New Roman" w:cs="Times New Roman"/>
+                <w:sz w:val="26"/>
+                <w:szCs w:val="26"/>
+              </w:rPr>
+              <w:t>/</w:t>
+            </w:r>
+            <w:r>
+              <w:rPr>
+                <w:rFonts w:ascii="Times New Roman" w:eastAsia="Times New Roman" w:hAnsi="Times New Roman" w:cs="Times New Roman"/>
+                <w:sz w:val="26"/>
+                <w:szCs w:val="26"/>
+              </w:rPr>
+              <w:t>12</w:t>
             </w:r>
           </w:p>
         </w:tc>
@@ -7757,6 +7869,7 @@
   <w:style w:type="character" w:default="1" w:styleId="Phngmcinhcuaoanvn">
     <w:name w:val="Default Paragraph Font"/>
     <w:uiPriority w:val="1"/>
+    <w:semiHidden/>
     <w:unhideWhenUsed/>
   </w:style>
   <w:style w:type="table" w:default="1" w:styleId="BangThngthng">

</xml_diff>